<commit_message>
feat: Cierre Maestro Ciclo 10 - Ingeniería 100% SICC-Ready y Purga de Residuos Legacy
</commit_message>
<xml_diff>
--- a/X_ENTREGABLES_CONSOLIDADOS/8_DOCUMENTOS_SERVIDOS/WORD/ESPECIALIDAD_04_Ingenieria_Sistemas_EJECUTIVO.docx
+++ b/X_ENTREGABLES_CONSOLIDADOS/8_DOCUMENTOS_SERVIDOS/WORD/ESPECIALIDAD_04_Ingenieria_Sistemas_EJECUTIVO.docx
@@ -456,7 +456,7 @@
           <w:b/>
           <w:bCs/>
         </w:rPr>
-        <w:t xml:space="preserve">CTC-ITCS:</w:t>
+        <w:t xml:space="preserve">CTC-PTC:</w:t>
       </w:r>
       <w:r>
         <w:t xml:space="preserve"> </w:t>
@@ -478,7 +478,7 @@
           <w:b/>
           <w:bCs/>
         </w:rPr>
-        <w:t xml:space="preserve">TETRA-GSM-R:</w:t>
+        <w:t xml:space="preserve">TETRA-RED TETRA (Misión Crítica):</w:t>
       </w:r>
       <w:r>
         <w:t xml:space="preserve"> </w:t>
@@ -616,7 +616,7 @@
         <w:t xml:space="preserve"> </w:t>
       </w:r>
       <w:r>
-        <w:t xml:space="preserve">Comunicaciones GSM-R estándar internacional</w:t>
+        <w:t xml:space="preserve">Comunicaciones RED TETRA (Misión Crítica) estándar internacional</w:t>
       </w:r>
       <w:r>
         <w:t xml:space="preserve"> </w:t>
@@ -704,7 +704,7 @@
         <w:t xml:space="preserve"> </w:t>
       </w:r>
       <w:r>
-        <w:t xml:space="preserve">Interfaces CTC-ITCS específicas</w:t>
+        <w:t xml:space="preserve">Interfaces CTC-PTC específicas</w:t>
       </w:r>
       <w:r>
         <w:t xml:space="preserve"> </w:t>

</xml_diff>

<commit_message>
SICC v7.3.1: Masterchef Serve - Dictamenes Portal Deploy
</commit_message>
<xml_diff>
--- a/X_ENTREGABLES_CONSOLIDADOS/8_DOCUMENTOS_SERVIDOS/WORD/ESPECIALIDAD_04_Ingenieria_Sistemas_EJECUTIVO.docx
+++ b/X_ENTREGABLES_CONSOLIDADOS/8_DOCUMENTOS_SERVIDOS/WORD/ESPECIALIDAD_04_Ingenieria_Sistemas_EJECUTIVO.docx
@@ -28,7 +28,7 @@
         </w:p>
       </w:sdtContent>
     </w:sdt>
-    <w:bookmarkStart w:id="63" w:name="especialidad-04-ingeniería-de-sistemas"/>
+    <w:bookmarkStart w:id="62" w:name="especialidad-04-ingeniería-de-sistemas"/>
     <w:p>
       <w:pPr>
         <w:pStyle w:val="Heading1"/>
@@ -177,13 +177,13 @@
           <w:bCs/>
           <w:b/>
         </w:rPr>
-        <w:t xml:space="preserve">25 interfaces críticas:</w:t>
-      </w:r>
-      <w:r>
-        <w:t xml:space="preserve"> </w:t>
-      </w:r>
-      <w:r>
-        <w:t xml:space="preserve">Comunicación entre sistemas</w:t>
+        <w:t xml:space="preserve">12 APIs:</w:t>
+      </w:r>
+      <w:r>
+        <w:t xml:space="preserve"> </w:t>
+      </w:r>
+      <w:r>
+        <w:t xml:space="preserve">Comunicación con sistemas externos</w:t>
       </w:r>
     </w:p>
     <w:p>
@@ -199,13 +199,13 @@
           <w:bCs/>
           <w:b/>
         </w:rPr>
-        <w:t xml:space="preserve">15 protocolos:</w:t>
-      </w:r>
-      <w:r>
-        <w:t xml:space="preserve"> </w:t>
-      </w:r>
-      <w:r>
-        <w:t xml:space="preserve">Estándares de interoperabilidad</w:t>
+        <w:t xml:space="preserve">22 interfaces críticas:</w:t>
+      </w:r>
+      <w:r>
+        <w:t xml:space="preserve"> </w:t>
+      </w:r>
+      <w:r>
+        <w:t xml:space="preserve">Comunicación entre sistemas</w:t>
       </w:r>
     </w:p>
     <w:p>
@@ -586,7 +586,7 @@
         <w:t xml:space="preserve"> </w:t>
       </w:r>
       <w:r>
-        <w:t xml:space="preserve">3 interfaces para interoperabilidad nacional</w:t>
+        <w:t xml:space="preserve">Procedimiento operacional a bordo</w:t>
       </w:r>
     </w:p>
     <w:bookmarkEnd w:id="25"/>
@@ -1011,7 +1011,7 @@
     </w:p>
     <w:bookmarkEnd w:id="29"/>
     <w:bookmarkEnd w:id="30"/>
-    <w:bookmarkStart w:id="33" w:name="componentes-principales"/>
+    <w:bookmarkStart w:id="32" w:name="componentes-principales"/>
     <w:p>
       <w:pPr>
         <w:pStyle w:val="Heading2"/>
@@ -1157,124 +1157,6 @@
       </w:r>
       <w:r>
         <w:t xml:space="preserve">| 99.95% | Sistemas críticos |</w:t>
-      </w:r>
-    </w:p>
-    <w:bookmarkEnd w:id="31"/>
-    <w:bookmarkStart w:id="32" w:name="gateway-de-integración"/>
-    <w:p>
-      <w:pPr>
-        <w:pStyle w:val="Heading3"/>
-      </w:pPr>
-      <w:r>
-        <w:t xml:space="preserve">2. Gateway de Integración</w:t>
-      </w:r>
-    </w:p>
-    <w:p>
-      <w:pPr>
-        <w:pStyle w:val="FirstParagraph"/>
-      </w:pPr>
-      <w:r>
-        <w:rPr>
-          <w:bCs/>
-          <w:b/>
-        </w:rPr>
-        <w:t xml:space="preserve">Propósito:</w:t>
-      </w:r>
-      <w:r>
-        <w:t xml:space="preserve"> </w:t>
-      </w:r>
-      <w:r>
-        <w:t xml:space="preserve">Conversión de protocolos entre sistemas</w:t>
-      </w:r>
-    </w:p>
-    <w:p>
-      <w:pPr>
-        <w:pStyle w:val="BodyText"/>
-      </w:pPr>
-      <w:r>
-        <w:rPr>
-          <w:bCs/>
-          <w:b/>
-        </w:rPr>
-        <w:t xml:space="preserve">Componentes instalados:</w:t>
-      </w:r>
-      <w:r>
-        <w:t xml:space="preserve"> </w:t>
-      </w:r>
-      <w:r>
-        <w:t xml:space="preserve">| Componente | Cantidad | Función | Estado |</w:t>
-      </w:r>
-      <w:r>
-        <w:t xml:space="preserve"> </w:t>
-      </w:r>
-      <w:r>
-        <w:t xml:space="preserve">|:———–|:———|:——–|:——-|</w:t>
-      </w:r>
-      <w:r>
-        <w:t xml:space="preserve"> </w:t>
-      </w:r>
-      <w:r>
-        <w:t xml:space="preserve">|</w:t>
-      </w:r>
-      <w:r>
-        <w:t xml:space="preserve"> </w:t>
-      </w:r>
-      <w:r>
-        <w:rPr>
-          <w:bCs/>
-          <w:b/>
-        </w:rPr>
-        <w:t xml:space="preserve">Gateway FRA/AREMA</w:t>
-      </w:r>
-      <w:r>
-        <w:t xml:space="preserve"> </w:t>
-      </w:r>
-      <w:r>
-        <w:t xml:space="preserve">| 1 unidad | Conversión protocolos | ⏳ En desarrollo |</w:t>
-      </w:r>
-      <w:r>
-        <w:t xml:space="preserve"> </w:t>
-      </w:r>
-      <w:r>
-        <w:t xml:space="preserve">|</w:t>
-      </w:r>
-      <w:r>
-        <w:t xml:space="preserve"> </w:t>
-      </w:r>
-      <w:r>
-        <w:rPr>
-          <w:bCs/>
-          <w:b/>
-        </w:rPr>
-        <w:t xml:space="preserve">Sistema de monitoreo</w:t>
-      </w:r>
-      <w:r>
-        <w:t xml:space="preserve"> </w:t>
-      </w:r>
-      <w:r>
-        <w:t xml:space="preserve">| 1 unidad | Supervisión integrada | ⏳ En desarrollo |</w:t>
-      </w:r>
-      <w:r>
-        <w:t xml:space="preserve"> </w:t>
-      </w:r>
-      <w:r>
-        <w:t xml:space="preserve">|</w:t>
-      </w:r>
-      <w:r>
-        <w:t xml:space="preserve"> </w:t>
-      </w:r>
-      <w:r>
-        <w:rPr>
-          <w:bCs/>
-          <w:b/>
-        </w:rPr>
-        <w:t xml:space="preserve">Sistema de control</w:t>
-      </w:r>
-      <w:r>
-        <w:t xml:space="preserve"> </w:t>
-      </w:r>
-      <w:r>
-        <w:t xml:space="preserve">| 1 unidad | Coordinación centralizada | ⏳ En desarrollo |</w:t>
       </w:r>
     </w:p>
     <w:p>
@@ -1284,9 +1166,9 @@
         </w:pict>
       </w:r>
     </w:p>
+    <w:bookmarkEnd w:id="31"/>
     <w:bookmarkEnd w:id="32"/>
-    <w:bookmarkEnd w:id="33"/>
-    <w:bookmarkStart w:id="36" w:name="especificaciones-técnicas-clave"/>
+    <w:bookmarkStart w:id="35" w:name="especificaciones-técnicas-clave"/>
     <w:p>
       <w:pPr>
         <w:pStyle w:val="Heading2"/>
@@ -1295,7 +1177,7 @@
         <w:t xml:space="preserve">📐 ESPECIFICACIONES TÉCNICAS CLAVE</w:t>
       </w:r>
     </w:p>
-    <w:bookmarkStart w:id="34" w:name="tabla-consolidada-de-especificaciones"/>
+    <w:bookmarkStart w:id="33" w:name="tabla-consolidada-de-especificaciones"/>
     <w:p>
       <w:pPr>
         <w:pStyle w:val="Heading3"/>
@@ -1366,31 +1248,31 @@
               <w:jc w:val="left"/>
             </w:pPr>
             <w:r>
-              <w:t xml:space="preserve">Interfaces críticas</w:t>
-            </w:r>
-          </w:p>
-        </w:tc>
-        <w:tc>
-          <w:tcPr/>
-          <w:p>
-            <w:pPr>
-              <w:pStyle w:val="Compact"/>
-              <w:jc w:val="left"/>
-            </w:pPr>
-            <w:r>
-              <w:t xml:space="preserve">25</w:t>
-            </w:r>
-          </w:p>
-        </w:tc>
-        <w:tc>
-          <w:tcPr/>
-          <w:p>
-            <w:pPr>
-              <w:pStyle w:val="Compact"/>
-              <w:jc w:val="left"/>
-            </w:pPr>
-            <w:r>
-              <w:t xml:space="preserve">Especificaciones proyecto</w:t>
+              <w:t xml:space="preserve">Protocolos</w:t>
+            </w:r>
+          </w:p>
+        </w:tc>
+        <w:tc>
+          <w:tcPr/>
+          <w:p>
+            <w:pPr>
+              <w:pStyle w:val="Compact"/>
+              <w:jc w:val="left"/>
+            </w:pPr>
+            <w:r>
+              <w:t xml:space="preserve">12</w:t>
+            </w:r>
+          </w:p>
+        </w:tc>
+        <w:tc>
+          <w:tcPr/>
+          <w:p>
+            <w:pPr>
+              <w:pStyle w:val="Compact"/>
+              <w:jc w:val="left"/>
+            </w:pPr>
+            <w:r>
+              <w:t xml:space="preserve">FRA/AREMA + FFFIS</w:t>
             </w:r>
           </w:p>
         </w:tc>
@@ -1404,31 +1286,31 @@
               <w:jc w:val="left"/>
             </w:pPr>
             <w:r>
-              <w:t xml:space="preserve">Protocolos</w:t>
-            </w:r>
-          </w:p>
-        </w:tc>
-        <w:tc>
-          <w:tcPr/>
-          <w:p>
-            <w:pPr>
-              <w:pStyle w:val="Compact"/>
-              <w:jc w:val="left"/>
-            </w:pPr>
-            <w:r>
-              <w:t xml:space="preserve">15</w:t>
-            </w:r>
-          </w:p>
-        </w:tc>
-        <w:tc>
-          <w:tcPr/>
-          <w:p>
-            <w:pPr>
-              <w:pStyle w:val="Compact"/>
-              <w:jc w:val="left"/>
-            </w:pPr>
-            <w:r>
-              <w:t xml:space="preserve">FRA/AREMA + FFFIS</w:t>
+              <w:t xml:space="preserve">APIs externas</w:t>
+            </w:r>
+          </w:p>
+        </w:tc>
+        <w:tc>
+          <w:tcPr/>
+          <w:p>
+            <w:pPr>
+              <w:pStyle w:val="Compact"/>
+              <w:jc w:val="left"/>
+            </w:pPr>
+            <w:r>
+              <w:t xml:space="preserve">12</w:t>
+            </w:r>
+          </w:p>
+        </w:tc>
+        <w:tc>
+          <w:tcPr/>
+          <w:p>
+            <w:pPr>
+              <w:pStyle w:val="Compact"/>
+              <w:jc w:val="left"/>
+            </w:pPr>
+            <w:r>
+              <w:t xml:space="preserve">Especificaciones proyecto</w:t>
             </w:r>
           </w:p>
         </w:tc>
@@ -1442,31 +1324,31 @@
               <w:jc w:val="left"/>
             </w:pPr>
             <w:r>
-              <w:t xml:space="preserve">APIs externas</w:t>
-            </w:r>
-          </w:p>
-        </w:tc>
-        <w:tc>
-          <w:tcPr/>
-          <w:p>
-            <w:pPr>
-              <w:pStyle w:val="Compact"/>
-              <w:jc w:val="left"/>
-            </w:pPr>
-            <w:r>
-              <w:t xml:space="preserve">12</w:t>
-            </w:r>
-          </w:p>
-        </w:tc>
-        <w:tc>
-          <w:tcPr/>
-          <w:p>
-            <w:pPr>
-              <w:pStyle w:val="Compact"/>
-              <w:jc w:val="left"/>
-            </w:pPr>
-            <w:r>
-              <w:t xml:space="preserve">Especificaciones proyecto</w:t>
+              <w:t xml:space="preserve">Disponibilidad</w:t>
+            </w:r>
+          </w:p>
+        </w:tc>
+        <w:tc>
+          <w:tcPr/>
+          <w:p>
+            <w:pPr>
+              <w:pStyle w:val="Compact"/>
+              <w:jc w:val="left"/>
+            </w:pPr>
+            <w:r>
+              <w:t xml:space="preserve">99.95%</w:t>
+            </w:r>
+          </w:p>
+        </w:tc>
+        <w:tc>
+          <w:tcPr/>
+          <w:p>
+            <w:pPr>
+              <w:pStyle w:val="Compact"/>
+              <w:jc w:val="left"/>
+            </w:pPr>
+            <w:r>
+              <w:t xml:space="preserve">AT4</w:t>
             </w:r>
           </w:p>
         </w:tc>
@@ -1480,44 +1362,6 @@
               <w:jc w:val="left"/>
             </w:pPr>
             <w:r>
-              <w:t xml:space="preserve">Disponibilidad</w:t>
-            </w:r>
-          </w:p>
-        </w:tc>
-        <w:tc>
-          <w:tcPr/>
-          <w:p>
-            <w:pPr>
-              <w:pStyle w:val="Compact"/>
-              <w:jc w:val="left"/>
-            </w:pPr>
-            <w:r>
-              <w:t xml:space="preserve">99.95%</w:t>
-            </w:r>
-          </w:p>
-        </w:tc>
-        <w:tc>
-          <w:tcPr/>
-          <w:p>
-            <w:pPr>
-              <w:pStyle w:val="Compact"/>
-              <w:jc w:val="left"/>
-            </w:pPr>
-            <w:r>
-              <w:t xml:space="preserve">AT4</w:t>
-            </w:r>
-          </w:p>
-        </w:tc>
-      </w:tr>
-      <w:tr>
-        <w:tc>
-          <w:tcPr/>
-          <w:p>
-            <w:pPr>
-              <w:pStyle w:val="Compact"/>
-              <w:jc w:val="left"/>
-            </w:pPr>
-            <w:r>
               <w:t xml:space="preserve">Tiempo de respuesta</w:t>
             </w:r>
           </w:p>
@@ -1548,8 +1392,8 @@
         </w:tc>
       </w:tr>
     </w:tbl>
-    <w:bookmarkEnd w:id="34"/>
-    <w:bookmarkStart w:id="35" w:name="criterios-de-aceptación"/>
+    <w:bookmarkEnd w:id="33"/>
+    <w:bookmarkStart w:id="34" w:name="criterios-de-aceptación"/>
     <w:p>
       <w:pPr>
         <w:pStyle w:val="Heading3"/>
@@ -1567,7 +1411,7 @@
         <w:pStyle w:val="Compact"/>
       </w:pPr>
       <w:r>
-        <w:t xml:space="preserve">✅ 25 interfaces críticas operativas</w:t>
+        <w:t xml:space="preserve">✅ 22 interfaces críticas operativas</w:t>
       </w:r>
     </w:p>
     <w:p>
@@ -1579,7 +1423,7 @@
         <w:pStyle w:val="Compact"/>
       </w:pPr>
       <w:r>
-        <w:t xml:space="preserve">✅ 15 protocolos implementados</w:t>
+        <w:t xml:space="preserve">✅ 12 protocolos implementados</w:t>
       </w:r>
     </w:p>
     <w:p>
@@ -1603,18 +1447,6 @@
         <w:pStyle w:val="Compact"/>
       </w:pPr>
       <w:r>
-        <w:t xml:space="preserve">✅ Gateway de integración operativo</w:t>
-      </w:r>
-    </w:p>
-    <w:p>
-      <w:pPr>
-        <w:numPr>
-          <w:ilvl w:val="0"/>
-          <w:numId w:val="1003"/>
-        </w:numPr>
-        <w:pStyle w:val="Compact"/>
-      </w:pPr>
-      <w:r>
         <w:t xml:space="preserve">✅ Disponibilidad 99.95%</w:t>
       </w:r>
     </w:p>
@@ -1625,24 +1457,42 @@
         </w:pict>
       </w:r>
     </w:p>
+    <w:bookmarkEnd w:id="34"/>
     <w:bookmarkEnd w:id="35"/>
+    <w:bookmarkStart w:id="38" w:name="ubicación-y-despliegue"/>
+    <w:p>
+      <w:pPr>
+        <w:pStyle w:val="Heading2"/>
+      </w:pPr>
+      <w:r>
+        <w:t xml:space="preserve">📍 UBICACIÓN Y DESPLIEGUE</w:t>
+      </w:r>
+    </w:p>
+    <w:bookmarkStart w:id="36" w:name="mapa-de-despliegue"/>
+    <w:p>
+      <w:pPr>
+        <w:pStyle w:val="Heading3"/>
+      </w:pPr>
+      <w:r>
+        <w:t xml:space="preserve">Mapa de despliegue</w:t>
+      </w:r>
+    </w:p>
+    <w:p>
+      <w:pPr>
+        <w:pStyle w:val="FirstParagraph"/>
+      </w:pPr>
+      <w:r>
+        <w:t xml:space="preserve">Los sistemas de integración están centralizados en el CCO La Dorada y se extienden a todos los sistemas del proyecto.</w:t>
+      </w:r>
+    </w:p>
     <w:bookmarkEnd w:id="36"/>
-    <w:bookmarkStart w:id="39" w:name="ubicación-y-despliegue"/>
-    <w:p>
-      <w:pPr>
-        <w:pStyle w:val="Heading2"/>
-      </w:pPr>
-      <w:r>
-        <w:t xml:space="preserve">📍 UBICACIÓN Y DESPLIEGUE</w:t>
-      </w:r>
-    </w:p>
-    <w:bookmarkStart w:id="37" w:name="mapa-de-despliegue"/>
+    <w:bookmarkStart w:id="37" w:name="tabla-de-ubicaciones-principales"/>
     <w:p>
       <w:pPr>
         <w:pStyle w:val="Heading3"/>
       </w:pPr>
       <w:r>
-        <w:t xml:space="preserve">Mapa de despliegue</w:t>
+        <w:t xml:space="preserve">Tabla de ubicaciones principales</w:t>
       </w:r>
     </w:p>
     <w:p>
@@ -1650,195 +1500,35 @@
         <w:pStyle w:val="FirstParagraph"/>
       </w:pPr>
       <w:r>
-        <w:t xml:space="preserve">Los sistemas de integración están centralizados en el CCO La Dorada y se extienden a todos los sistemas del proyecto.</w:t>
-      </w:r>
-    </w:p>
-    <w:bookmarkEnd w:id="37"/>
-    <w:bookmarkStart w:id="38" w:name="tabla-de-ubicaciones-principales"/>
-    <w:p>
-      <w:pPr>
-        <w:pStyle w:val="Heading3"/>
-      </w:pPr>
-      <w:r>
-        <w:t xml:space="preserve">Tabla de ubicaciones principales</w:t>
-      </w:r>
-    </w:p>
-    <w:tbl>
-      <w:tblPr>
-        <w:tblStyle w:val="Table"/>
-        <w:tblW w:type="pct" w:w="5000"/>
-        <w:tblLook w:firstRow="1" w:lastRow="0" w:firstColumn="0" w:lastColumn="0" w:noHBand="0" w:noVBand="0" w:val="0020"/>
-        <w:jc w:val="start"/>
-        <w:tblLayout w:type="fixed"/>
-      </w:tblPr>
-      <w:tblGrid>
-        <w:gridCol w:w="2124"/>
-        <w:gridCol w:w="2511"/>
-        <w:gridCol w:w="1738"/>
-        <w:gridCol w:w="1545"/>
-      </w:tblGrid>
-      <w:tr>
-        <w:trPr>
-          <w:tblHeader w:val="true"/>
-        </w:trPr>
-        <w:tc>
-          <w:tcPr/>
-          <w:p>
-            <w:pPr>
-              <w:pStyle w:val="Compact"/>
-              <w:jc w:val="left"/>
-            </w:pPr>
-            <w:r>
-              <w:t xml:space="preserve">Ubicación</w:t>
-            </w:r>
-          </w:p>
-        </w:tc>
-        <w:tc>
-          <w:tcPr/>
-          <w:p>
-            <w:pPr>
-              <w:pStyle w:val="Compact"/>
-              <w:jc w:val="left"/>
-            </w:pPr>
-            <w:r>
-              <w:t xml:space="preserve">Componentes</w:t>
-            </w:r>
-          </w:p>
-        </w:tc>
-        <w:tc>
-          <w:tcPr/>
-          <w:p>
-            <w:pPr>
-              <w:pStyle w:val="Compact"/>
-              <w:jc w:val="left"/>
-            </w:pPr>
-            <w:r>
-              <w:t xml:space="preserve">Función</w:t>
-            </w:r>
-          </w:p>
-        </w:tc>
-        <w:tc>
-          <w:tcPr/>
-          <w:p>
-            <w:pPr>
-              <w:pStyle w:val="Compact"/>
-              <w:jc w:val="left"/>
-            </w:pPr>
-            <w:r>
-              <w:t xml:space="preserve">Estado</w:t>
-            </w:r>
-          </w:p>
-        </w:tc>
-      </w:tr>
-      <w:tr>
-        <w:tc>
-          <w:tcPr/>
-          <w:p>
-            <w:pPr>
-              <w:pStyle w:val="Compact"/>
-              <w:jc w:val="left"/>
-            </w:pPr>
-            <w:r>
-              <w:rPr>
-                <w:bCs/>
-                <w:b/>
-              </w:rPr>
-              <w:t xml:space="preserve">CCO La Dorada</w:t>
-            </w:r>
-          </w:p>
-        </w:tc>
-        <w:tc>
-          <w:tcPr/>
-          <w:p>
-            <w:pPr>
-              <w:pStyle w:val="Compact"/>
-              <w:jc w:val="left"/>
-            </w:pPr>
-            <w:r>
-              <w:t xml:space="preserve">Gateway + Monitoreo + Control</w:t>
-            </w:r>
-          </w:p>
-        </w:tc>
-        <w:tc>
-          <w:tcPr/>
-          <w:p>
-            <w:pPr>
-              <w:pStyle w:val="Compact"/>
-              <w:jc w:val="left"/>
-            </w:pPr>
-            <w:r>
-              <w:t xml:space="preserve">Integración centralizada</w:t>
-            </w:r>
-          </w:p>
-        </w:tc>
-        <w:tc>
-          <w:tcPr/>
-          <w:p>
-            <w:pPr>
-              <w:pStyle w:val="Compact"/>
-              <w:jc w:val="left"/>
-            </w:pPr>
-            <w:r>
-              <w:t xml:space="preserve">⏳ En desarrollo</w:t>
-            </w:r>
-          </w:p>
-        </w:tc>
-      </w:tr>
-      <w:tr>
-        <w:tc>
-          <w:tcPr/>
-          <w:p>
-            <w:pPr>
-              <w:pStyle w:val="Compact"/>
-              <w:jc w:val="left"/>
-            </w:pPr>
-            <w:r>
-              <w:rPr>
-                <w:bCs/>
-                <w:b/>
-              </w:rPr>
-              <w:t xml:space="preserve">Sistemas distribuidos</w:t>
-            </w:r>
-          </w:p>
-        </w:tc>
-        <w:tc>
-          <w:tcPr/>
-          <w:p>
-            <w:pPr>
-              <w:pStyle w:val="Compact"/>
-              <w:jc w:val="left"/>
-            </w:pPr>
-            <w:r>
-              <w:t xml:space="preserve">Interfaces + APIs</w:t>
-            </w:r>
-          </w:p>
-        </w:tc>
-        <w:tc>
-          <w:tcPr/>
-          <w:p>
-            <w:pPr>
-              <w:pStyle w:val="Compact"/>
-              <w:jc w:val="left"/>
-            </w:pPr>
-            <w:r>
-              <w:t xml:space="preserve">Comunicación distribuida</w:t>
-            </w:r>
-          </w:p>
-        </w:tc>
-        <w:tc>
-          <w:tcPr/>
-          <w:p>
-            <w:pPr>
-              <w:pStyle w:val="Compact"/>
-              <w:jc w:val="left"/>
-            </w:pPr>
-            <w:r>
-              <w:t xml:space="preserve">⏳ En desarrollo</w:t>
-            </w:r>
-          </w:p>
-        </w:tc>
-      </w:tr>
-    </w:tbl>
+        <w:rPr>
+          <w:bCs/>
+          <w:b/>
+        </w:rPr>
+        <w:t xml:space="preserve">CCO La Dorada</w:t>
+      </w:r>
+      <w:r>
+        <w:t xml:space="preserve"> </w:t>
+      </w:r>
+      <w:r>
+        <w:t xml:space="preserve">| Monitoreo + Control | Integración centralizada | ⏳ En desarrollo |</w:t>
+      </w:r>
+      <w:r>
+        <w:br/>
+      </w:r>
+      <w:r>
+        <w:rPr>
+          <w:bCs/>
+          <w:b/>
+        </w:rPr>
+        <w:t xml:space="preserve">Sistemas distribuidos</w:t>
+      </w:r>
+      <w:r>
+        <w:t xml:space="preserve"> </w:t>
+      </w:r>
+      <w:r>
+        <w:t xml:space="preserve">| Interfaces + APIs | Comunicación distribuida | ⏳ En desarrollo |</w:t>
+      </w:r>
+    </w:p>
     <w:p>
       <w:r>
         <w:pict>
@@ -1846,36 +1536,36 @@
         </w:pict>
       </w:r>
     </w:p>
+    <w:bookmarkEnd w:id="37"/>
     <w:bookmarkEnd w:id="38"/>
+    <w:bookmarkStart w:id="42" w:name="operación-y-mantenimiento"/>
+    <w:p>
+      <w:pPr>
+        <w:pStyle w:val="Heading2"/>
+      </w:pPr>
+      <w:r>
+        <w:t xml:space="preserve">⚙️ OPERACIÓN Y MANTENIMIENTO</w:t>
+      </w:r>
+    </w:p>
+    <w:bookmarkStart w:id="39" w:name="operación-normal"/>
+    <w:p>
+      <w:pPr>
+        <w:pStyle w:val="Heading3"/>
+      </w:pPr>
+      <w:r>
+        <w:t xml:space="preserve">Operación normal</w:t>
+      </w:r>
+    </w:p>
+    <w:p>
+      <w:pPr>
+        <w:pStyle w:val="FirstParagraph"/>
+      </w:pPr>
+      <w:r>
+        <w:t xml:space="preserve">Los sistemas de integración operan 24/7 coordinando todos los sistemas técnicos, con monitoreo automático de interfaces y protocolos.</w:t>
+      </w:r>
+    </w:p>
     <w:bookmarkEnd w:id="39"/>
-    <w:bookmarkStart w:id="43" w:name="operación-y-mantenimiento"/>
-    <w:p>
-      <w:pPr>
-        <w:pStyle w:val="Heading2"/>
-      </w:pPr>
-      <w:r>
-        <w:t xml:space="preserve">⚙️ OPERACIÓN Y MANTENIMIENTO</w:t>
-      </w:r>
-    </w:p>
-    <w:bookmarkStart w:id="40" w:name="operación-normal"/>
-    <w:p>
-      <w:pPr>
-        <w:pStyle w:val="Heading3"/>
-      </w:pPr>
-      <w:r>
-        <w:t xml:space="preserve">Operación normal</w:t>
-      </w:r>
-    </w:p>
-    <w:p>
-      <w:pPr>
-        <w:pStyle w:val="FirstParagraph"/>
-      </w:pPr>
-      <w:r>
-        <w:t xml:space="preserve">Los sistemas de integración operan 24/7 coordinando todos los sistemas técnicos, con monitoreo automático de interfaces y protocolos.</w:t>
-      </w:r>
-    </w:p>
-    <w:bookmarkEnd w:id="40"/>
-    <w:bookmarkStart w:id="41" w:name="mantenimiento-preventivo"/>
+    <w:bookmarkStart w:id="40" w:name="mantenimiento-preventivo"/>
     <w:p>
       <w:pPr>
         <w:pStyle w:val="Heading3"/>
@@ -1994,8 +1684,8 @@
         <w:t xml:space="preserve">Certificación de interoperabilidad</w:t>
       </w:r>
     </w:p>
-    <w:bookmarkEnd w:id="41"/>
-    <w:bookmarkStart w:id="42" w:name="respuesta-a-fallas"/>
+    <w:bookmarkEnd w:id="40"/>
+    <w:bookmarkStart w:id="41" w:name="respuesta-a-fallas"/>
     <w:p>
       <w:pPr>
         <w:pStyle w:val="Heading3"/>
@@ -2121,75 +1811,75 @@
         </w:pict>
       </w:r>
     </w:p>
+    <w:bookmarkEnd w:id="41"/>
     <w:bookmarkEnd w:id="42"/>
+    <w:bookmarkStart w:id="45" w:name="interfaces-con-otras-especialidades"/>
+    <w:p>
+      <w:pPr>
+        <w:pStyle w:val="Heading2"/>
+      </w:pPr>
+      <w:r>
+        <w:t xml:space="preserve">🔗 INTERFACES CON OTRAS ESPECIALIDADES</w:t>
+      </w:r>
+    </w:p>
+    <w:bookmarkStart w:id="43" w:name="diagrama-de-interfaces"/>
+    <w:p>
+      <w:pPr>
+        <w:pStyle w:val="Heading3"/>
+      </w:pPr>
+      <w:r>
+        <w:t xml:space="preserve">Diagrama de interfaces</w:t>
+      </w:r>
+    </w:p>
+    <w:p>
+      <w:pPr>
+        <w:pStyle w:val="SourceCode"/>
+      </w:pPr>
+      <w:r>
+        <w:rPr>
+          <w:rStyle w:val="VerbatimChar"/>
+        </w:rPr>
+        <w:t xml:space="preserve">[Ingeniería de Sistemas] ←→ [Todas las Especialidades]</w:t>
+      </w:r>
+      <w:r>
+        <w:br/>
+      </w:r>
+      <w:r>
+        <w:rPr>
+          <w:rStyle w:val="VerbatimChar"/>
+        </w:rPr>
+        <w:t xml:space="preserve">         ↓</w:t>
+      </w:r>
+      <w:r>
+        <w:br/>
+      </w:r>
+      <w:r>
+        <w:rPr>
+          <w:rStyle w:val="VerbatimChar"/>
+        </w:rPr>
+        <w:t xml:space="preserve">[Integración y Coordinación]</w:t>
+      </w:r>
+      <w:r>
+        <w:br/>
+      </w:r>
+      <w:r>
+        <w:rPr>
+          <w:rStyle w:val="VerbatimChar"/>
+        </w:rPr>
+        <w:t xml:space="preserve">         ↓</w:t>
+      </w:r>
+      <w:r>
+        <w:br/>
+      </w:r>
+      <w:r>
+        <w:rPr>
+          <w:rStyle w:val="VerbatimChar"/>
+        </w:rPr>
+        <w:t xml:space="preserve">[Funcionamiento Unificado]</w:t>
+      </w:r>
+    </w:p>
     <w:bookmarkEnd w:id="43"/>
-    <w:bookmarkStart w:id="46" w:name="interfaces-con-otras-especialidades"/>
-    <w:p>
-      <w:pPr>
-        <w:pStyle w:val="Heading2"/>
-      </w:pPr>
-      <w:r>
-        <w:t xml:space="preserve">🔗 INTERFACES CON OTRAS ESPECIALIDADES</w:t>
-      </w:r>
-    </w:p>
-    <w:bookmarkStart w:id="44" w:name="diagrama-de-interfaces"/>
-    <w:p>
-      <w:pPr>
-        <w:pStyle w:val="Heading3"/>
-      </w:pPr>
-      <w:r>
-        <w:t xml:space="preserve">Diagrama de interfaces</w:t>
-      </w:r>
-    </w:p>
-    <w:p>
-      <w:pPr>
-        <w:pStyle w:val="SourceCode"/>
-      </w:pPr>
-      <w:r>
-        <w:rPr>
-          <w:rStyle w:val="VerbatimChar"/>
-        </w:rPr>
-        <w:t xml:space="preserve">[Ingeniería de Sistemas] ←→ [Todas las Especialidades]</w:t>
-      </w:r>
-      <w:r>
-        <w:br/>
-      </w:r>
-      <w:r>
-        <w:rPr>
-          <w:rStyle w:val="VerbatimChar"/>
-        </w:rPr>
-        <w:t xml:space="preserve">         ↓</w:t>
-      </w:r>
-      <w:r>
-        <w:br/>
-      </w:r>
-      <w:r>
-        <w:rPr>
-          <w:rStyle w:val="VerbatimChar"/>
-        </w:rPr>
-        <w:t xml:space="preserve">[Integración y Coordinación]</w:t>
-      </w:r>
-      <w:r>
-        <w:br/>
-      </w:r>
-      <w:r>
-        <w:rPr>
-          <w:rStyle w:val="VerbatimChar"/>
-        </w:rPr>
-        <w:t xml:space="preserve">         ↓</w:t>
-      </w:r>
-      <w:r>
-        <w:br/>
-      </w:r>
-      <w:r>
-        <w:rPr>
-          <w:rStyle w:val="VerbatimChar"/>
-        </w:rPr>
-        <w:t xml:space="preserve">[Funcionamiento Unificado]</w:t>
-      </w:r>
-    </w:p>
-    <w:bookmarkEnd w:id="44"/>
-    <w:bookmarkStart w:id="45" w:name="tabla-de-interfaces-críticas"/>
+    <w:bookmarkStart w:id="44" w:name="tabla-de-interfaces-críticas"/>
     <w:p>
       <w:pPr>
         <w:pStyle w:val="Heading3"/>
@@ -2488,9 +2178,9 @@
         </w:pict>
       </w:r>
     </w:p>
+    <w:bookmarkEnd w:id="44"/>
     <w:bookmarkEnd w:id="45"/>
-    <w:bookmarkEnd w:id="46"/>
-    <w:bookmarkStart w:id="50" w:name="supuestos-técnicos-y-limitaciones"/>
+    <w:bookmarkStart w:id="49" w:name="supuestos-técnicos-y-limitaciones"/>
     <w:p>
       <w:pPr>
         <w:pStyle w:val="Heading2"/>
@@ -2499,7 +2189,7 @@
         <w:t xml:space="preserve">📋 SUPUESTOS TÉCNICOS Y LIMITACIONES</w:t>
       </w:r>
     </w:p>
-    <w:bookmarkStart w:id="47" w:name="supuestos-críticos-del-diseno"/>
+    <w:bookmarkStart w:id="46" w:name="supuestos-críticos-del-diseno"/>
     <w:p>
       <w:pPr>
         <w:pStyle w:val="Heading3"/>
@@ -2678,7 +2368,7 @@
               <w:jc w:val="left"/>
             </w:pPr>
             <w:r>
-              <w:t xml:space="preserve">Gateway de conversión</w:t>
+              <w:t xml:space="preserve">Mapeo de protocolos</w:t>
             </w:r>
           </w:p>
         </w:tc>
@@ -2732,7 +2422,7 @@
               <w:jc w:val="left"/>
             </w:pPr>
             <w:r>
-              <w:t xml:space="preserve">Compatibilidad dual</w:t>
+              <w:t xml:space="preserve">Procedimiento Operacional</w:t>
             </w:r>
           </w:p>
         </w:tc>
@@ -2792,8 +2482,8 @@
         </w:tc>
       </w:tr>
     </w:tbl>
-    <w:bookmarkEnd w:id="47"/>
-    <w:bookmarkStart w:id="48" w:name="limitaciones-del-diseno"/>
+    <w:bookmarkEnd w:id="46"/>
+    <w:bookmarkStart w:id="47" w:name="limitaciones-del-diseno"/>
     <w:p>
       <w:pPr>
         <w:pStyle w:val="Heading3"/>
@@ -2912,8 +2602,8 @@
         <w:t xml:space="preserve">Múltiples puntos de acceso</w:t>
       </w:r>
     </w:p>
-    <w:bookmarkEnd w:id="48"/>
-    <w:bookmarkStart w:id="49" w:name="dependencias-críticas"/>
+    <w:bookmarkEnd w:id="47"/>
+    <w:bookmarkStart w:id="48" w:name="dependencias-críticas"/>
     <w:p>
       <w:pPr>
         <w:pStyle w:val="Heading3"/>
@@ -3039,9 +2729,9 @@
         </w:pict>
       </w:r>
     </w:p>
+    <w:bookmarkEnd w:id="48"/>
     <w:bookmarkEnd w:id="49"/>
-    <w:bookmarkEnd w:id="50"/>
-    <w:bookmarkStart w:id="51" w:name="riesgos-y-mitigaciones"/>
+    <w:bookmarkStart w:id="50" w:name="riesgos-y-mitigaciones"/>
     <w:p>
       <w:pPr>
         <w:pStyle w:val="Heading2"/>
@@ -3237,7 +2927,7 @@
               <w:jc w:val="left"/>
             </w:pPr>
             <w:r>
-              <w:t xml:space="preserve">Gateway de conversión</w:t>
+              <w:t xml:space="preserve">Mapeo estandarizado</w:t>
             </w:r>
           </w:p>
         </w:tc>
@@ -3448,8 +3138,8 @@
         </w:pict>
       </w:r>
     </w:p>
-    <w:bookmarkEnd w:id="51"/>
-    <w:bookmarkStart w:id="54" w:name="cumplimiento-contractual"/>
+    <w:bookmarkEnd w:id="50"/>
+    <w:bookmarkStart w:id="53" w:name="cumplimiento-contractual"/>
     <w:p>
       <w:pPr>
         <w:pStyle w:val="Heading2"/>
@@ -3458,7 +3148,7 @@
         <w:t xml:space="preserve">📋 CUMPLIMIENTO CONTRACTUAL</w:t>
       </w:r>
     </w:p>
-    <w:bookmarkStart w:id="52" w:name="obligaciones-clave-del-contrato"/>
+    <w:bookmarkStart w:id="51" w:name="obligaciones-clave-del-contrato"/>
     <w:p>
       <w:pPr>
         <w:pStyle w:val="Heading3"/>
@@ -3579,8 +3269,8 @@
         <w:t xml:space="preserve">Compatibilidad FENOCO - En progreso</w:t>
       </w:r>
     </w:p>
-    <w:bookmarkEnd w:id="52"/>
-    <w:bookmarkStart w:id="53" w:name="referencias-contractuales"/>
+    <w:bookmarkEnd w:id="51"/>
+    <w:bookmarkStart w:id="52" w:name="referencias-contractuales"/>
     <w:p>
       <w:pPr>
         <w:pStyle w:val="Heading3"/>
@@ -3684,9 +3374,9 @@
         </w:pict>
       </w:r>
     </w:p>
+    <w:bookmarkEnd w:id="52"/>
     <w:bookmarkEnd w:id="53"/>
-    <w:bookmarkEnd w:id="54"/>
-    <w:bookmarkStart w:id="57" w:name="documentación-de-soporte"/>
+    <w:bookmarkStart w:id="56" w:name="documentación-de-soporte"/>
     <w:p>
       <w:pPr>
         <w:pStyle w:val="Heading2"/>
@@ -3695,7 +3385,7 @@
         <w:t xml:space="preserve">📚 DOCUMENTACIÓN DE SOPORTE</w:t>
       </w:r>
     </w:p>
-    <w:bookmarkStart w:id="55" w:name="documentos-técnicos-disponibles"/>
+    <w:bookmarkStart w:id="54" w:name="documentos-técnicos-disponibles"/>
     <w:p>
       <w:pPr>
         <w:pStyle w:val="Heading3"/>
@@ -3872,8 +3562,8 @@
         </w:tc>
       </w:tr>
     </w:tbl>
-    <w:bookmarkEnd w:id="55"/>
-    <w:bookmarkStart w:id="56" w:name="para-más-información-técnica"/>
+    <w:bookmarkEnd w:id="54"/>
+    <w:bookmarkStart w:id="55" w:name="para-más-información-técnica"/>
     <w:p>
       <w:pPr>
         <w:pStyle w:val="Heading3"/>
@@ -3897,9 +3587,9 @@
         </w:pict>
       </w:r>
     </w:p>
+    <w:bookmarkEnd w:id="55"/>
     <w:bookmarkEnd w:id="56"/>
-    <w:bookmarkEnd w:id="57"/>
-    <w:bookmarkStart w:id="58" w:name="contactos-y-responsables"/>
+    <w:bookmarkStart w:id="57" w:name="contactos-y-responsables"/>
     <w:p>
       <w:pPr>
         <w:pStyle w:val="Heading2"/>
@@ -4083,8 +3773,8 @@
         </w:pict>
       </w:r>
     </w:p>
-    <w:bookmarkEnd w:id="58"/>
-    <w:bookmarkStart w:id="59" w:name="indicadores-de-desempeno-kpis"/>
+    <w:bookmarkEnd w:id="57"/>
+    <w:bookmarkStart w:id="58" w:name="indicadores-de-desempeno-kpis"/>
     <w:p>
       <w:pPr>
         <w:pStyle w:val="Heading2"/>
@@ -4417,8 +4107,8 @@
         </w:pict>
       </w:r>
     </w:p>
-    <w:bookmarkEnd w:id="59"/>
-    <w:bookmarkStart w:id="61" w:name="decisiones-tecnicas-aplicadas"/>
+    <w:bookmarkEnd w:id="58"/>
+    <w:bookmarkStart w:id="60" w:name="decisiones-tecnicas-aplicadas"/>
     <w:p>
       <w:pPr>
         <w:pStyle w:val="Heading2"/>
@@ -4427,7 +4117,7 @@
         <w:t xml:space="preserve">📋 DECISIONES TECNICAS APLICADAS</w:t>
       </w:r>
     </w:p>
-    <w:bookmarkStart w:id="60" w:name="software-redes-integracion"/>
+    <w:bookmarkStart w:id="59" w:name="software-redes-integracion"/>
     <w:p>
       <w:pPr>
         <w:pStyle w:val="Heading3"/>
@@ -4467,9 +4157,9 @@
         </w:pict>
       </w:r>
     </w:p>
+    <w:bookmarkEnd w:id="59"/>
     <w:bookmarkEnd w:id="60"/>
-    <w:bookmarkEnd w:id="61"/>
-    <w:bookmarkStart w:id="62" w:name="control-de-versiones"/>
+    <w:bookmarkStart w:id="61" w:name="control-de-versiones"/>
     <w:p>
       <w:pPr>
         <w:pStyle w:val="Heading2"/>
@@ -4669,8 +4359,8 @@
         <w:t xml:space="preserve">ESPECIALIDAD_04_Ingenieria_Sistemas_Master.md v1.0</w:t>
       </w:r>
     </w:p>
+    <w:bookmarkEnd w:id="61"/>
     <w:bookmarkEnd w:id="62"/>
-    <w:bookmarkEnd w:id="63"/>
     <w:sectPr/>
   </w:body>
 </w:document>

</xml_diff>